<commit_message>
Front Integration section (basic api + frontend)
</commit_message>
<xml_diff>
--- a/Documentation/Section16b________________Project2__________ fastapi  with SqlModel____project2.docx
+++ b/Documentation/Section16b________________Project2__________ fastapi  with SqlModel____project2.docx
@@ -28618,6 +28618,1545 @@
           <w:szCs w:val="21"/>
         </w:rPr>
       </w:pPr>
+    </w:p>
+    <w:p/>
+    <w:p/>
+    <w:p>
+      <w:pPr>
+        <w:pStyle w:val="Heading1"/>
+      </w:pPr>
+      <w:r>
+        <w:t>Updated Models with Pydantic Support</w:t>
+      </w:r>
+    </w:p>
+    <w:p>
+      <w:pPr>
+        <w:pStyle w:val="NormalWeb"/>
+      </w:pPr>
+      <w:r>
+        <w:t>File:</w:t>
+      </w:r>
+    </w:p>
+    <w:p>
+      <w:pPr>
+        <w:pStyle w:val="HTMLPreformatted"/>
+      </w:pPr>
+      <w:r>
+        <w:t>app/tasks/models.py</w:t>
+      </w:r>
+    </w:p>
+    <w:p>
+      <w:pPr>
+        <w:shd w:val="clear" w:color="auto" w:fill="1E1E1E"/>
+        <w:spacing w:line="300" w:lineRule="atLeast"/>
+        <w:rPr>
+          <w:rFonts w:ascii="Consolas" w:hAnsi="Consolas"/>
+          <w:color w:val="D4D4D4"/>
+          <w:sz w:val="23"/>
+          <w:szCs w:val="23"/>
+        </w:rPr>
+      </w:pPr>
+      <w:r>
+        <w:rPr>
+          <w:rFonts w:ascii="Consolas" w:hAnsi="Consolas"/>
+          <w:color w:val="C586C0"/>
+          <w:sz w:val="23"/>
+          <w:szCs w:val="23"/>
+        </w:rPr>
+        <w:t>from</w:t>
+      </w:r>
+      <w:r>
+        <w:rPr>
+          <w:rFonts w:ascii="Consolas" w:hAnsi="Consolas"/>
+          <w:color w:val="D4D4D4"/>
+          <w:sz w:val="23"/>
+          <w:szCs w:val="23"/>
+        </w:rPr>
+        <w:t xml:space="preserve"> </w:t>
+      </w:r>
+      <w:r>
+        <w:rPr>
+          <w:rFonts w:ascii="Consolas" w:hAnsi="Consolas"/>
+          <w:color w:val="4EC9B0"/>
+          <w:sz w:val="23"/>
+          <w:szCs w:val="23"/>
+        </w:rPr>
+        <w:t>sqlmodel</w:t>
+      </w:r>
+      <w:r>
+        <w:rPr>
+          <w:rFonts w:ascii="Consolas" w:hAnsi="Consolas"/>
+          <w:color w:val="D4D4D4"/>
+          <w:sz w:val="23"/>
+          <w:szCs w:val="23"/>
+        </w:rPr>
+        <w:t xml:space="preserve"> </w:t>
+      </w:r>
+      <w:r>
+        <w:rPr>
+          <w:rFonts w:ascii="Consolas" w:hAnsi="Consolas"/>
+          <w:color w:val="C586C0"/>
+          <w:sz w:val="23"/>
+          <w:szCs w:val="23"/>
+        </w:rPr>
+        <w:t>import</w:t>
+      </w:r>
+      <w:r>
+        <w:rPr>
+          <w:rFonts w:ascii="Consolas" w:hAnsi="Consolas"/>
+          <w:color w:val="D4D4D4"/>
+          <w:sz w:val="23"/>
+          <w:szCs w:val="23"/>
+        </w:rPr>
+        <w:t xml:space="preserve"> </w:t>
+      </w:r>
+      <w:r>
+        <w:rPr>
+          <w:rFonts w:ascii="Consolas" w:hAnsi="Consolas"/>
+          <w:color w:val="4EC9B0"/>
+          <w:sz w:val="23"/>
+          <w:szCs w:val="23"/>
+        </w:rPr>
+        <w:t>SQLModel</w:t>
+      </w:r>
+      <w:r>
+        <w:rPr>
+          <w:rFonts w:ascii="Consolas" w:hAnsi="Consolas"/>
+          <w:color w:val="D4D4D4"/>
+          <w:sz w:val="23"/>
+          <w:szCs w:val="23"/>
+        </w:rPr>
+        <w:t xml:space="preserve">, </w:t>
+      </w:r>
+      <w:r>
+        <w:rPr>
+          <w:rFonts w:ascii="Consolas" w:hAnsi="Consolas"/>
+          <w:color w:val="DCDCAA"/>
+          <w:sz w:val="23"/>
+          <w:szCs w:val="23"/>
+        </w:rPr>
+        <w:t>Field</w:t>
+      </w:r>
+    </w:p>
+    <w:p>
+      <w:pPr>
+        <w:shd w:val="clear" w:color="auto" w:fill="1E1E1E"/>
+        <w:spacing w:after="240" w:line="300" w:lineRule="atLeast"/>
+        <w:rPr>
+          <w:rFonts w:ascii="Consolas" w:hAnsi="Consolas"/>
+          <w:color w:val="D4D4D4"/>
+          <w:sz w:val="23"/>
+          <w:szCs w:val="23"/>
+        </w:rPr>
+      </w:pPr>
+    </w:p>
+    <w:p>
+      <w:pPr>
+        <w:shd w:val="clear" w:color="auto" w:fill="1E1E1E"/>
+        <w:spacing w:line="300" w:lineRule="atLeast"/>
+        <w:rPr>
+          <w:rFonts w:ascii="Consolas" w:hAnsi="Consolas"/>
+          <w:color w:val="D4D4D4"/>
+          <w:sz w:val="23"/>
+          <w:szCs w:val="23"/>
+        </w:rPr>
+      </w:pPr>
+      <w:r>
+        <w:rPr>
+          <w:rFonts w:ascii="Consolas" w:hAnsi="Consolas"/>
+          <w:color w:val="6A9955"/>
+          <w:sz w:val="23"/>
+          <w:szCs w:val="23"/>
+        </w:rPr>
+        <w:t># -----------------------------</w:t>
+      </w:r>
+    </w:p>
+    <w:p>
+      <w:pPr>
+        <w:shd w:val="clear" w:color="auto" w:fill="1E1E1E"/>
+        <w:spacing w:line="300" w:lineRule="atLeast"/>
+        <w:rPr>
+          <w:rFonts w:ascii="Consolas" w:hAnsi="Consolas"/>
+          <w:color w:val="D4D4D4"/>
+          <w:sz w:val="23"/>
+          <w:szCs w:val="23"/>
+        </w:rPr>
+      </w:pPr>
+      <w:r>
+        <w:rPr>
+          <w:rFonts w:ascii="Consolas" w:hAnsi="Consolas"/>
+          <w:color w:val="6A9955"/>
+          <w:sz w:val="23"/>
+          <w:szCs w:val="23"/>
+        </w:rPr>
+        <w:t># Shared Base Schema</w:t>
+      </w:r>
+    </w:p>
+    <w:p>
+      <w:pPr>
+        <w:shd w:val="clear" w:color="auto" w:fill="1E1E1E"/>
+        <w:spacing w:line="300" w:lineRule="atLeast"/>
+        <w:rPr>
+          <w:rFonts w:ascii="Consolas" w:hAnsi="Consolas"/>
+          <w:color w:val="D4D4D4"/>
+          <w:sz w:val="23"/>
+          <w:szCs w:val="23"/>
+        </w:rPr>
+      </w:pPr>
+      <w:r>
+        <w:rPr>
+          <w:rFonts w:ascii="Consolas" w:hAnsi="Consolas"/>
+          <w:color w:val="6A9955"/>
+          <w:sz w:val="23"/>
+          <w:szCs w:val="23"/>
+        </w:rPr>
+        <w:t># -----------------------------</w:t>
+      </w:r>
+    </w:p>
+    <w:p>
+      <w:pPr>
+        <w:shd w:val="clear" w:color="auto" w:fill="1E1E1E"/>
+        <w:spacing w:line="300" w:lineRule="atLeast"/>
+        <w:rPr>
+          <w:rFonts w:ascii="Consolas" w:hAnsi="Consolas"/>
+          <w:color w:val="D4D4D4"/>
+          <w:sz w:val="23"/>
+          <w:szCs w:val="23"/>
+        </w:rPr>
+      </w:pPr>
+      <w:r>
+        <w:rPr>
+          <w:rFonts w:ascii="Consolas" w:hAnsi="Consolas"/>
+          <w:color w:val="569CD6"/>
+          <w:sz w:val="23"/>
+          <w:szCs w:val="23"/>
+        </w:rPr>
+        <w:t>class</w:t>
+      </w:r>
+      <w:r>
+        <w:rPr>
+          <w:rFonts w:ascii="Consolas" w:hAnsi="Consolas"/>
+          <w:color w:val="D4D4D4"/>
+          <w:sz w:val="23"/>
+          <w:szCs w:val="23"/>
+        </w:rPr>
+        <w:t xml:space="preserve"> </w:t>
+      </w:r>
+      <w:r>
+        <w:rPr>
+          <w:rFonts w:ascii="Consolas" w:hAnsi="Consolas"/>
+          <w:color w:val="4EC9B0"/>
+          <w:sz w:val="23"/>
+          <w:szCs w:val="23"/>
+        </w:rPr>
+        <w:t>TaskBase</w:t>
+      </w:r>
+      <w:r>
+        <w:rPr>
+          <w:rFonts w:ascii="Consolas" w:hAnsi="Consolas"/>
+          <w:color w:val="D4D4D4"/>
+          <w:sz w:val="23"/>
+          <w:szCs w:val="23"/>
+        </w:rPr>
+        <w:t>(</w:t>
+      </w:r>
+      <w:r>
+        <w:rPr>
+          <w:rFonts w:ascii="Consolas" w:hAnsi="Consolas"/>
+          <w:color w:val="4EC9B0"/>
+          <w:sz w:val="23"/>
+          <w:szCs w:val="23"/>
+        </w:rPr>
+        <w:t>SQLModel</w:t>
+      </w:r>
+      <w:r>
+        <w:rPr>
+          <w:rFonts w:ascii="Consolas" w:hAnsi="Consolas"/>
+          <w:color w:val="D4D4D4"/>
+          <w:sz w:val="23"/>
+          <w:szCs w:val="23"/>
+        </w:rPr>
+        <w:t>):</w:t>
+      </w:r>
+    </w:p>
+    <w:p>
+      <w:pPr>
+        <w:shd w:val="clear" w:color="auto" w:fill="1E1E1E"/>
+        <w:spacing w:line="300" w:lineRule="atLeast"/>
+        <w:rPr>
+          <w:rFonts w:ascii="Consolas" w:hAnsi="Consolas"/>
+          <w:color w:val="D4D4D4"/>
+          <w:sz w:val="23"/>
+          <w:szCs w:val="23"/>
+        </w:rPr>
+      </w:pPr>
+      <w:r>
+        <w:rPr>
+          <w:rFonts w:ascii="Consolas" w:hAnsi="Consolas"/>
+          <w:color w:val="D4D4D4"/>
+          <w:sz w:val="23"/>
+          <w:szCs w:val="23"/>
+        </w:rPr>
+        <w:t xml:space="preserve">    </w:t>
+      </w:r>
+      <w:r>
+        <w:rPr>
+          <w:rFonts w:ascii="Consolas" w:hAnsi="Consolas"/>
+          <w:color w:val="9CDCFE"/>
+          <w:sz w:val="23"/>
+          <w:szCs w:val="23"/>
+        </w:rPr>
+        <w:t>title</w:t>
+      </w:r>
+      <w:r>
+        <w:rPr>
+          <w:rFonts w:ascii="Consolas" w:hAnsi="Consolas"/>
+          <w:color w:val="D4D4D4"/>
+          <w:sz w:val="23"/>
+          <w:szCs w:val="23"/>
+        </w:rPr>
+        <w:t xml:space="preserve">: </w:t>
+      </w:r>
+      <w:r>
+        <w:rPr>
+          <w:rFonts w:ascii="Consolas" w:hAnsi="Consolas"/>
+          <w:color w:val="4EC9B0"/>
+          <w:sz w:val="23"/>
+          <w:szCs w:val="23"/>
+        </w:rPr>
+        <w:t>str</w:t>
+      </w:r>
+    </w:p>
+    <w:p>
+      <w:pPr>
+        <w:shd w:val="clear" w:color="auto" w:fill="1E1E1E"/>
+        <w:spacing w:line="300" w:lineRule="atLeast"/>
+        <w:rPr>
+          <w:rFonts w:ascii="Consolas" w:hAnsi="Consolas"/>
+          <w:color w:val="D4D4D4"/>
+          <w:sz w:val="23"/>
+          <w:szCs w:val="23"/>
+        </w:rPr>
+      </w:pPr>
+      <w:r>
+        <w:rPr>
+          <w:rFonts w:ascii="Consolas" w:hAnsi="Consolas"/>
+          <w:color w:val="D4D4D4"/>
+          <w:sz w:val="23"/>
+          <w:szCs w:val="23"/>
+        </w:rPr>
+        <w:t xml:space="preserve">    </w:t>
+      </w:r>
+      <w:r>
+        <w:rPr>
+          <w:rFonts w:ascii="Consolas" w:hAnsi="Consolas"/>
+          <w:color w:val="9CDCFE"/>
+          <w:sz w:val="23"/>
+          <w:szCs w:val="23"/>
+        </w:rPr>
+        <w:t>content</w:t>
+      </w:r>
+      <w:r>
+        <w:rPr>
+          <w:rFonts w:ascii="Consolas" w:hAnsi="Consolas"/>
+          <w:color w:val="D4D4D4"/>
+          <w:sz w:val="23"/>
+          <w:szCs w:val="23"/>
+        </w:rPr>
+        <w:t xml:space="preserve">: </w:t>
+      </w:r>
+      <w:r>
+        <w:rPr>
+          <w:rFonts w:ascii="Consolas" w:hAnsi="Consolas"/>
+          <w:color w:val="4EC9B0"/>
+          <w:sz w:val="23"/>
+          <w:szCs w:val="23"/>
+        </w:rPr>
+        <w:t>str</w:t>
+      </w:r>
+    </w:p>
+    <w:p>
+      <w:pPr>
+        <w:shd w:val="clear" w:color="auto" w:fill="1E1E1E"/>
+        <w:spacing w:after="240" w:line="300" w:lineRule="atLeast"/>
+        <w:rPr>
+          <w:rFonts w:ascii="Consolas" w:hAnsi="Consolas"/>
+          <w:color w:val="D4D4D4"/>
+          <w:sz w:val="23"/>
+          <w:szCs w:val="23"/>
+        </w:rPr>
+      </w:pPr>
+    </w:p>
+    <w:p>
+      <w:pPr>
+        <w:shd w:val="clear" w:color="auto" w:fill="1E1E1E"/>
+        <w:spacing w:line="300" w:lineRule="atLeast"/>
+        <w:rPr>
+          <w:rFonts w:ascii="Consolas" w:hAnsi="Consolas"/>
+          <w:color w:val="D4D4D4"/>
+          <w:sz w:val="23"/>
+          <w:szCs w:val="23"/>
+        </w:rPr>
+      </w:pPr>
+      <w:r>
+        <w:rPr>
+          <w:rFonts w:ascii="Consolas" w:hAnsi="Consolas"/>
+          <w:color w:val="6A9955"/>
+          <w:sz w:val="23"/>
+          <w:szCs w:val="23"/>
+        </w:rPr>
+        <w:t># -----------------------------</w:t>
+      </w:r>
+    </w:p>
+    <w:p>
+      <w:pPr>
+        <w:shd w:val="clear" w:color="auto" w:fill="1E1E1E"/>
+        <w:spacing w:line="300" w:lineRule="atLeast"/>
+        <w:rPr>
+          <w:rFonts w:ascii="Consolas" w:hAnsi="Consolas"/>
+          <w:color w:val="D4D4D4"/>
+          <w:sz w:val="23"/>
+          <w:szCs w:val="23"/>
+        </w:rPr>
+      </w:pPr>
+      <w:r>
+        <w:rPr>
+          <w:rFonts w:ascii="Consolas" w:hAnsi="Consolas"/>
+          <w:color w:val="6A9955"/>
+          <w:sz w:val="23"/>
+          <w:szCs w:val="23"/>
+        </w:rPr>
+        <w:t># Create Schema (POST)</w:t>
+      </w:r>
+    </w:p>
+    <w:p>
+      <w:pPr>
+        <w:shd w:val="clear" w:color="auto" w:fill="1E1E1E"/>
+        <w:spacing w:line="300" w:lineRule="atLeast"/>
+        <w:rPr>
+          <w:rFonts w:ascii="Consolas" w:hAnsi="Consolas"/>
+          <w:color w:val="D4D4D4"/>
+          <w:sz w:val="23"/>
+          <w:szCs w:val="23"/>
+        </w:rPr>
+      </w:pPr>
+      <w:r>
+        <w:rPr>
+          <w:rFonts w:ascii="Consolas" w:hAnsi="Consolas"/>
+          <w:color w:val="6A9955"/>
+          <w:sz w:val="23"/>
+          <w:szCs w:val="23"/>
+        </w:rPr>
+        <w:t># -----------------------------</w:t>
+      </w:r>
+    </w:p>
+    <w:p>
+      <w:pPr>
+        <w:shd w:val="clear" w:color="auto" w:fill="1E1E1E"/>
+        <w:spacing w:line="300" w:lineRule="atLeast"/>
+        <w:rPr>
+          <w:rFonts w:ascii="Consolas" w:hAnsi="Consolas"/>
+          <w:color w:val="D4D4D4"/>
+          <w:sz w:val="23"/>
+          <w:szCs w:val="23"/>
+        </w:rPr>
+      </w:pPr>
+      <w:r>
+        <w:rPr>
+          <w:rFonts w:ascii="Consolas" w:hAnsi="Consolas"/>
+          <w:color w:val="569CD6"/>
+          <w:sz w:val="23"/>
+          <w:szCs w:val="23"/>
+        </w:rPr>
+        <w:t>class</w:t>
+      </w:r>
+      <w:r>
+        <w:rPr>
+          <w:rFonts w:ascii="Consolas" w:hAnsi="Consolas"/>
+          <w:color w:val="D4D4D4"/>
+          <w:sz w:val="23"/>
+          <w:szCs w:val="23"/>
+        </w:rPr>
+        <w:t xml:space="preserve"> </w:t>
+      </w:r>
+      <w:r>
+        <w:rPr>
+          <w:rFonts w:ascii="Consolas" w:hAnsi="Consolas"/>
+          <w:color w:val="4EC9B0"/>
+          <w:sz w:val="23"/>
+          <w:szCs w:val="23"/>
+        </w:rPr>
+        <w:t>TaskCreate</w:t>
+      </w:r>
+      <w:r>
+        <w:rPr>
+          <w:rFonts w:ascii="Consolas" w:hAnsi="Consolas"/>
+          <w:color w:val="D4D4D4"/>
+          <w:sz w:val="23"/>
+          <w:szCs w:val="23"/>
+        </w:rPr>
+        <w:t>(</w:t>
+      </w:r>
+      <w:r>
+        <w:rPr>
+          <w:rFonts w:ascii="Consolas" w:hAnsi="Consolas"/>
+          <w:color w:val="4EC9B0"/>
+          <w:sz w:val="23"/>
+          <w:szCs w:val="23"/>
+        </w:rPr>
+        <w:t>TaskBase</w:t>
+      </w:r>
+      <w:r>
+        <w:rPr>
+          <w:rFonts w:ascii="Consolas" w:hAnsi="Consolas"/>
+          <w:color w:val="D4D4D4"/>
+          <w:sz w:val="23"/>
+          <w:szCs w:val="23"/>
+        </w:rPr>
+        <w:t>):</w:t>
+      </w:r>
+    </w:p>
+    <w:p>
+      <w:pPr>
+        <w:shd w:val="clear" w:color="auto" w:fill="1E1E1E"/>
+        <w:spacing w:line="300" w:lineRule="atLeast"/>
+        <w:rPr>
+          <w:rFonts w:ascii="Consolas" w:hAnsi="Consolas"/>
+          <w:color w:val="D4D4D4"/>
+          <w:sz w:val="23"/>
+          <w:szCs w:val="23"/>
+        </w:rPr>
+      </w:pPr>
+      <w:r>
+        <w:rPr>
+          <w:rFonts w:ascii="Consolas" w:hAnsi="Consolas"/>
+          <w:color w:val="D4D4D4"/>
+          <w:sz w:val="23"/>
+          <w:szCs w:val="23"/>
+        </w:rPr>
+        <w:t xml:space="preserve">    </w:t>
+      </w:r>
+      <w:r>
+        <w:rPr>
+          <w:rFonts w:ascii="Consolas" w:hAnsi="Consolas"/>
+          <w:color w:val="C586C0"/>
+          <w:sz w:val="23"/>
+          <w:szCs w:val="23"/>
+        </w:rPr>
+        <w:t>pass</w:t>
+      </w:r>
+    </w:p>
+    <w:p>
+      <w:pPr>
+        <w:shd w:val="clear" w:color="auto" w:fill="1E1E1E"/>
+        <w:spacing w:after="240" w:line="300" w:lineRule="atLeast"/>
+        <w:rPr>
+          <w:rFonts w:ascii="Consolas" w:hAnsi="Consolas"/>
+          <w:color w:val="D4D4D4"/>
+          <w:sz w:val="23"/>
+          <w:szCs w:val="23"/>
+        </w:rPr>
+      </w:pPr>
+    </w:p>
+    <w:p>
+      <w:pPr>
+        <w:shd w:val="clear" w:color="auto" w:fill="1E1E1E"/>
+        <w:spacing w:line="300" w:lineRule="atLeast"/>
+        <w:rPr>
+          <w:rFonts w:ascii="Consolas" w:hAnsi="Consolas"/>
+          <w:color w:val="D4D4D4"/>
+          <w:sz w:val="23"/>
+          <w:szCs w:val="23"/>
+        </w:rPr>
+      </w:pPr>
+      <w:r>
+        <w:rPr>
+          <w:rFonts w:ascii="Consolas" w:hAnsi="Consolas"/>
+          <w:color w:val="6A9955"/>
+          <w:sz w:val="23"/>
+          <w:szCs w:val="23"/>
+        </w:rPr>
+        <w:t># -----------------------------</w:t>
+      </w:r>
+    </w:p>
+    <w:p>
+      <w:pPr>
+        <w:shd w:val="clear" w:color="auto" w:fill="1E1E1E"/>
+        <w:spacing w:line="300" w:lineRule="atLeast"/>
+        <w:rPr>
+          <w:rFonts w:ascii="Consolas" w:hAnsi="Consolas"/>
+          <w:color w:val="D4D4D4"/>
+          <w:sz w:val="23"/>
+          <w:szCs w:val="23"/>
+        </w:rPr>
+      </w:pPr>
+      <w:r>
+        <w:rPr>
+          <w:rFonts w:ascii="Consolas" w:hAnsi="Consolas"/>
+          <w:color w:val="6A9955"/>
+          <w:sz w:val="23"/>
+          <w:szCs w:val="23"/>
+        </w:rPr>
+        <w:t># Full Update Schema (PUT)</w:t>
+      </w:r>
+    </w:p>
+    <w:p>
+      <w:pPr>
+        <w:shd w:val="clear" w:color="auto" w:fill="1E1E1E"/>
+        <w:spacing w:line="300" w:lineRule="atLeast"/>
+        <w:rPr>
+          <w:rFonts w:ascii="Consolas" w:hAnsi="Consolas"/>
+          <w:color w:val="D4D4D4"/>
+          <w:sz w:val="23"/>
+          <w:szCs w:val="23"/>
+        </w:rPr>
+      </w:pPr>
+      <w:r>
+        <w:rPr>
+          <w:rFonts w:ascii="Consolas" w:hAnsi="Consolas"/>
+          <w:color w:val="6A9955"/>
+          <w:sz w:val="23"/>
+          <w:szCs w:val="23"/>
+        </w:rPr>
+        <w:t># -----------------------------</w:t>
+      </w:r>
+    </w:p>
+    <w:p>
+      <w:pPr>
+        <w:shd w:val="clear" w:color="auto" w:fill="1E1E1E"/>
+        <w:spacing w:line="300" w:lineRule="atLeast"/>
+        <w:rPr>
+          <w:rFonts w:ascii="Consolas" w:hAnsi="Consolas"/>
+          <w:color w:val="D4D4D4"/>
+          <w:sz w:val="23"/>
+          <w:szCs w:val="23"/>
+        </w:rPr>
+      </w:pPr>
+      <w:r>
+        <w:rPr>
+          <w:rFonts w:ascii="Consolas" w:hAnsi="Consolas"/>
+          <w:color w:val="569CD6"/>
+          <w:sz w:val="23"/>
+          <w:szCs w:val="23"/>
+        </w:rPr>
+        <w:lastRenderedPageBreak/>
+        <w:t>class</w:t>
+      </w:r>
+      <w:r>
+        <w:rPr>
+          <w:rFonts w:ascii="Consolas" w:hAnsi="Consolas"/>
+          <w:color w:val="D4D4D4"/>
+          <w:sz w:val="23"/>
+          <w:szCs w:val="23"/>
+        </w:rPr>
+        <w:t xml:space="preserve"> </w:t>
+      </w:r>
+      <w:r>
+        <w:rPr>
+          <w:rFonts w:ascii="Consolas" w:hAnsi="Consolas"/>
+          <w:color w:val="4EC9B0"/>
+          <w:sz w:val="23"/>
+          <w:szCs w:val="23"/>
+        </w:rPr>
+        <w:t>TaskUpdate</w:t>
+      </w:r>
+      <w:r>
+        <w:rPr>
+          <w:rFonts w:ascii="Consolas" w:hAnsi="Consolas"/>
+          <w:color w:val="D4D4D4"/>
+          <w:sz w:val="23"/>
+          <w:szCs w:val="23"/>
+        </w:rPr>
+        <w:t>(</w:t>
+      </w:r>
+      <w:r>
+        <w:rPr>
+          <w:rFonts w:ascii="Consolas" w:hAnsi="Consolas"/>
+          <w:color w:val="4EC9B0"/>
+          <w:sz w:val="23"/>
+          <w:szCs w:val="23"/>
+        </w:rPr>
+        <w:t>TaskBase</w:t>
+      </w:r>
+      <w:r>
+        <w:rPr>
+          <w:rFonts w:ascii="Consolas" w:hAnsi="Consolas"/>
+          <w:color w:val="D4D4D4"/>
+          <w:sz w:val="23"/>
+          <w:szCs w:val="23"/>
+        </w:rPr>
+        <w:t>):</w:t>
+      </w:r>
+    </w:p>
+    <w:p>
+      <w:pPr>
+        <w:shd w:val="clear" w:color="auto" w:fill="1E1E1E"/>
+        <w:spacing w:line="300" w:lineRule="atLeast"/>
+        <w:rPr>
+          <w:rFonts w:ascii="Consolas" w:hAnsi="Consolas"/>
+          <w:color w:val="D4D4D4"/>
+          <w:sz w:val="23"/>
+          <w:szCs w:val="23"/>
+        </w:rPr>
+      </w:pPr>
+      <w:r>
+        <w:rPr>
+          <w:rFonts w:ascii="Consolas" w:hAnsi="Consolas"/>
+          <w:color w:val="D4D4D4"/>
+          <w:sz w:val="23"/>
+          <w:szCs w:val="23"/>
+        </w:rPr>
+        <w:t xml:space="preserve">    </w:t>
+      </w:r>
+      <w:r>
+        <w:rPr>
+          <w:rFonts w:ascii="Consolas" w:hAnsi="Consolas"/>
+          <w:color w:val="C586C0"/>
+          <w:sz w:val="23"/>
+          <w:szCs w:val="23"/>
+        </w:rPr>
+        <w:t>pass</w:t>
+      </w:r>
+    </w:p>
+    <w:p>
+      <w:pPr>
+        <w:shd w:val="clear" w:color="auto" w:fill="1E1E1E"/>
+        <w:spacing w:after="240" w:line="300" w:lineRule="atLeast"/>
+        <w:rPr>
+          <w:rFonts w:ascii="Consolas" w:hAnsi="Consolas"/>
+          <w:color w:val="D4D4D4"/>
+          <w:sz w:val="23"/>
+          <w:szCs w:val="23"/>
+        </w:rPr>
+      </w:pPr>
+    </w:p>
+    <w:p>
+      <w:pPr>
+        <w:shd w:val="clear" w:color="auto" w:fill="1E1E1E"/>
+        <w:spacing w:line="300" w:lineRule="atLeast"/>
+        <w:rPr>
+          <w:rFonts w:ascii="Consolas" w:hAnsi="Consolas"/>
+          <w:color w:val="D4D4D4"/>
+          <w:sz w:val="23"/>
+          <w:szCs w:val="23"/>
+        </w:rPr>
+      </w:pPr>
+      <w:r>
+        <w:rPr>
+          <w:rFonts w:ascii="Consolas" w:hAnsi="Consolas"/>
+          <w:color w:val="6A9955"/>
+          <w:sz w:val="23"/>
+          <w:szCs w:val="23"/>
+        </w:rPr>
+        <w:t># -----------------------------</w:t>
+      </w:r>
+    </w:p>
+    <w:p>
+      <w:pPr>
+        <w:shd w:val="clear" w:color="auto" w:fill="1E1E1E"/>
+        <w:spacing w:line="300" w:lineRule="atLeast"/>
+        <w:rPr>
+          <w:rFonts w:ascii="Consolas" w:hAnsi="Consolas"/>
+          <w:color w:val="D4D4D4"/>
+          <w:sz w:val="23"/>
+          <w:szCs w:val="23"/>
+        </w:rPr>
+      </w:pPr>
+      <w:r>
+        <w:rPr>
+          <w:rFonts w:ascii="Consolas" w:hAnsi="Consolas"/>
+          <w:color w:val="6A9955"/>
+          <w:sz w:val="23"/>
+          <w:szCs w:val="23"/>
+        </w:rPr>
+        <w:t># Partial Update Schema (PATCH)</w:t>
+      </w:r>
+    </w:p>
+    <w:p>
+      <w:pPr>
+        <w:shd w:val="clear" w:color="auto" w:fill="1E1E1E"/>
+        <w:spacing w:line="300" w:lineRule="atLeast"/>
+        <w:rPr>
+          <w:rFonts w:ascii="Consolas" w:hAnsi="Consolas"/>
+          <w:color w:val="D4D4D4"/>
+          <w:sz w:val="23"/>
+          <w:szCs w:val="23"/>
+        </w:rPr>
+      </w:pPr>
+      <w:r>
+        <w:rPr>
+          <w:rFonts w:ascii="Consolas" w:hAnsi="Consolas"/>
+          <w:color w:val="6A9955"/>
+          <w:sz w:val="23"/>
+          <w:szCs w:val="23"/>
+        </w:rPr>
+        <w:t># -----------------------------</w:t>
+      </w:r>
+    </w:p>
+    <w:p>
+      <w:pPr>
+        <w:shd w:val="clear" w:color="auto" w:fill="1E1E1E"/>
+        <w:spacing w:line="300" w:lineRule="atLeast"/>
+        <w:rPr>
+          <w:rFonts w:ascii="Consolas" w:hAnsi="Consolas"/>
+          <w:color w:val="D4D4D4"/>
+          <w:sz w:val="23"/>
+          <w:szCs w:val="23"/>
+        </w:rPr>
+      </w:pPr>
+      <w:r>
+        <w:rPr>
+          <w:rFonts w:ascii="Consolas" w:hAnsi="Consolas"/>
+          <w:color w:val="569CD6"/>
+          <w:sz w:val="23"/>
+          <w:szCs w:val="23"/>
+        </w:rPr>
+        <w:t>class</w:t>
+      </w:r>
+      <w:r>
+        <w:rPr>
+          <w:rFonts w:ascii="Consolas" w:hAnsi="Consolas"/>
+          <w:color w:val="D4D4D4"/>
+          <w:sz w:val="23"/>
+          <w:szCs w:val="23"/>
+        </w:rPr>
+        <w:t xml:space="preserve"> </w:t>
+      </w:r>
+      <w:r>
+        <w:rPr>
+          <w:rFonts w:ascii="Consolas" w:hAnsi="Consolas"/>
+          <w:color w:val="4EC9B0"/>
+          <w:sz w:val="23"/>
+          <w:szCs w:val="23"/>
+        </w:rPr>
+        <w:t>TaskPatch</w:t>
+      </w:r>
+      <w:r>
+        <w:rPr>
+          <w:rFonts w:ascii="Consolas" w:hAnsi="Consolas"/>
+          <w:color w:val="D4D4D4"/>
+          <w:sz w:val="23"/>
+          <w:szCs w:val="23"/>
+        </w:rPr>
+        <w:t>(</w:t>
+      </w:r>
+      <w:r>
+        <w:rPr>
+          <w:rFonts w:ascii="Consolas" w:hAnsi="Consolas"/>
+          <w:color w:val="4EC9B0"/>
+          <w:sz w:val="23"/>
+          <w:szCs w:val="23"/>
+        </w:rPr>
+        <w:t>SQLModel</w:t>
+      </w:r>
+      <w:r>
+        <w:rPr>
+          <w:rFonts w:ascii="Consolas" w:hAnsi="Consolas"/>
+          <w:color w:val="D4D4D4"/>
+          <w:sz w:val="23"/>
+          <w:szCs w:val="23"/>
+        </w:rPr>
+        <w:t>):</w:t>
+      </w:r>
+    </w:p>
+    <w:p>
+      <w:pPr>
+        <w:shd w:val="clear" w:color="auto" w:fill="1E1E1E"/>
+        <w:spacing w:line="300" w:lineRule="atLeast"/>
+        <w:rPr>
+          <w:rFonts w:ascii="Consolas" w:hAnsi="Consolas"/>
+          <w:color w:val="D4D4D4"/>
+          <w:sz w:val="23"/>
+          <w:szCs w:val="23"/>
+        </w:rPr>
+      </w:pPr>
+      <w:r>
+        <w:rPr>
+          <w:rFonts w:ascii="Consolas" w:hAnsi="Consolas"/>
+          <w:color w:val="D4D4D4"/>
+          <w:sz w:val="23"/>
+          <w:szCs w:val="23"/>
+        </w:rPr>
+        <w:t xml:space="preserve">    </w:t>
+      </w:r>
+      <w:r>
+        <w:rPr>
+          <w:rFonts w:ascii="Consolas" w:hAnsi="Consolas"/>
+          <w:color w:val="9CDCFE"/>
+          <w:sz w:val="23"/>
+          <w:szCs w:val="23"/>
+        </w:rPr>
+        <w:t>title</w:t>
+      </w:r>
+      <w:r>
+        <w:rPr>
+          <w:rFonts w:ascii="Consolas" w:hAnsi="Consolas"/>
+          <w:color w:val="D4D4D4"/>
+          <w:sz w:val="23"/>
+          <w:szCs w:val="23"/>
+        </w:rPr>
+        <w:t xml:space="preserve">: </w:t>
+      </w:r>
+      <w:r>
+        <w:rPr>
+          <w:rFonts w:ascii="Consolas" w:hAnsi="Consolas"/>
+          <w:color w:val="4EC9B0"/>
+          <w:sz w:val="23"/>
+          <w:szCs w:val="23"/>
+        </w:rPr>
+        <w:t>str</w:t>
+      </w:r>
+      <w:r>
+        <w:rPr>
+          <w:rFonts w:ascii="Consolas" w:hAnsi="Consolas"/>
+          <w:color w:val="D4D4D4"/>
+          <w:sz w:val="23"/>
+          <w:szCs w:val="23"/>
+        </w:rPr>
+        <w:t xml:space="preserve"> | </w:t>
+      </w:r>
+      <w:r>
+        <w:rPr>
+          <w:rFonts w:ascii="Consolas" w:hAnsi="Consolas"/>
+          <w:color w:val="4FC1FF"/>
+          <w:sz w:val="23"/>
+          <w:szCs w:val="23"/>
+        </w:rPr>
+        <w:t>None</w:t>
+      </w:r>
+      <w:r>
+        <w:rPr>
+          <w:rFonts w:ascii="Consolas" w:hAnsi="Consolas"/>
+          <w:color w:val="D4D4D4"/>
+          <w:sz w:val="23"/>
+          <w:szCs w:val="23"/>
+        </w:rPr>
+        <w:t xml:space="preserve"> = </w:t>
+      </w:r>
+      <w:r>
+        <w:rPr>
+          <w:rFonts w:ascii="Consolas" w:hAnsi="Consolas"/>
+          <w:color w:val="4FC1FF"/>
+          <w:sz w:val="23"/>
+          <w:szCs w:val="23"/>
+        </w:rPr>
+        <w:t>None</w:t>
+      </w:r>
+    </w:p>
+    <w:p>
+      <w:pPr>
+        <w:shd w:val="clear" w:color="auto" w:fill="1E1E1E"/>
+        <w:spacing w:line="300" w:lineRule="atLeast"/>
+        <w:rPr>
+          <w:rFonts w:ascii="Consolas" w:hAnsi="Consolas"/>
+          <w:color w:val="D4D4D4"/>
+          <w:sz w:val="23"/>
+          <w:szCs w:val="23"/>
+        </w:rPr>
+      </w:pPr>
+      <w:r>
+        <w:rPr>
+          <w:rFonts w:ascii="Consolas" w:hAnsi="Consolas"/>
+          <w:color w:val="D4D4D4"/>
+          <w:sz w:val="23"/>
+          <w:szCs w:val="23"/>
+        </w:rPr>
+        <w:t xml:space="preserve">    </w:t>
+      </w:r>
+      <w:r>
+        <w:rPr>
+          <w:rFonts w:ascii="Consolas" w:hAnsi="Consolas"/>
+          <w:color w:val="9CDCFE"/>
+          <w:sz w:val="23"/>
+          <w:szCs w:val="23"/>
+        </w:rPr>
+        <w:t>content</w:t>
+      </w:r>
+      <w:r>
+        <w:rPr>
+          <w:rFonts w:ascii="Consolas" w:hAnsi="Consolas"/>
+          <w:color w:val="D4D4D4"/>
+          <w:sz w:val="23"/>
+          <w:szCs w:val="23"/>
+        </w:rPr>
+        <w:t xml:space="preserve">: </w:t>
+      </w:r>
+      <w:r>
+        <w:rPr>
+          <w:rFonts w:ascii="Consolas" w:hAnsi="Consolas"/>
+          <w:color w:val="4EC9B0"/>
+          <w:sz w:val="23"/>
+          <w:szCs w:val="23"/>
+        </w:rPr>
+        <w:t>str</w:t>
+      </w:r>
+      <w:r>
+        <w:rPr>
+          <w:rFonts w:ascii="Consolas" w:hAnsi="Consolas"/>
+          <w:color w:val="D4D4D4"/>
+          <w:sz w:val="23"/>
+          <w:szCs w:val="23"/>
+        </w:rPr>
+        <w:t xml:space="preserve"> | </w:t>
+      </w:r>
+      <w:r>
+        <w:rPr>
+          <w:rFonts w:ascii="Consolas" w:hAnsi="Consolas"/>
+          <w:color w:val="4FC1FF"/>
+          <w:sz w:val="23"/>
+          <w:szCs w:val="23"/>
+        </w:rPr>
+        <w:t>None</w:t>
+      </w:r>
+      <w:r>
+        <w:rPr>
+          <w:rFonts w:ascii="Consolas" w:hAnsi="Consolas"/>
+          <w:color w:val="D4D4D4"/>
+          <w:sz w:val="23"/>
+          <w:szCs w:val="23"/>
+        </w:rPr>
+        <w:t xml:space="preserve"> = </w:t>
+      </w:r>
+      <w:r>
+        <w:rPr>
+          <w:rFonts w:ascii="Consolas" w:hAnsi="Consolas"/>
+          <w:color w:val="4FC1FF"/>
+          <w:sz w:val="23"/>
+          <w:szCs w:val="23"/>
+        </w:rPr>
+        <w:t>None</w:t>
+      </w:r>
+    </w:p>
+    <w:p>
+      <w:pPr>
+        <w:shd w:val="clear" w:color="auto" w:fill="1E1E1E"/>
+        <w:spacing w:after="240" w:line="300" w:lineRule="atLeast"/>
+        <w:rPr>
+          <w:rFonts w:ascii="Consolas" w:hAnsi="Consolas"/>
+          <w:color w:val="D4D4D4"/>
+          <w:sz w:val="23"/>
+          <w:szCs w:val="23"/>
+        </w:rPr>
+      </w:pPr>
+    </w:p>
+    <w:p>
+      <w:pPr>
+        <w:shd w:val="clear" w:color="auto" w:fill="1E1E1E"/>
+        <w:spacing w:line="300" w:lineRule="atLeast"/>
+        <w:rPr>
+          <w:rFonts w:ascii="Consolas" w:hAnsi="Consolas"/>
+          <w:color w:val="D4D4D4"/>
+          <w:sz w:val="23"/>
+          <w:szCs w:val="23"/>
+        </w:rPr>
+      </w:pPr>
+      <w:r>
+        <w:rPr>
+          <w:rFonts w:ascii="Consolas" w:hAnsi="Consolas"/>
+          <w:color w:val="6A9955"/>
+          <w:sz w:val="23"/>
+          <w:szCs w:val="23"/>
+        </w:rPr>
+        <w:t># -----------------------------</w:t>
+      </w:r>
+    </w:p>
+    <w:p>
+      <w:pPr>
+        <w:shd w:val="clear" w:color="auto" w:fill="1E1E1E"/>
+        <w:spacing w:line="300" w:lineRule="atLeast"/>
+        <w:rPr>
+          <w:rFonts w:ascii="Consolas" w:hAnsi="Consolas"/>
+          <w:color w:val="D4D4D4"/>
+          <w:sz w:val="23"/>
+          <w:szCs w:val="23"/>
+        </w:rPr>
+      </w:pPr>
+      <w:r>
+        <w:rPr>
+          <w:rFonts w:ascii="Consolas" w:hAnsi="Consolas"/>
+          <w:color w:val="6A9955"/>
+          <w:sz w:val="23"/>
+          <w:szCs w:val="23"/>
+        </w:rPr>
+        <w:t># Response Schema</w:t>
+      </w:r>
+    </w:p>
+    <w:p>
+      <w:pPr>
+        <w:shd w:val="clear" w:color="auto" w:fill="1E1E1E"/>
+        <w:spacing w:line="300" w:lineRule="atLeast"/>
+        <w:rPr>
+          <w:rFonts w:ascii="Consolas" w:hAnsi="Consolas"/>
+          <w:color w:val="D4D4D4"/>
+          <w:sz w:val="23"/>
+          <w:szCs w:val="23"/>
+        </w:rPr>
+      </w:pPr>
+      <w:r>
+        <w:rPr>
+          <w:rFonts w:ascii="Consolas" w:hAnsi="Consolas"/>
+          <w:color w:val="6A9955"/>
+          <w:sz w:val="23"/>
+          <w:szCs w:val="23"/>
+        </w:rPr>
+        <w:t># -----------------------------</w:t>
+      </w:r>
+    </w:p>
+    <w:p>
+      <w:pPr>
+        <w:shd w:val="clear" w:color="auto" w:fill="1E1E1E"/>
+        <w:spacing w:line="300" w:lineRule="atLeast"/>
+        <w:rPr>
+          <w:rFonts w:ascii="Consolas" w:hAnsi="Consolas"/>
+          <w:color w:val="D4D4D4"/>
+          <w:sz w:val="23"/>
+          <w:szCs w:val="23"/>
+        </w:rPr>
+      </w:pPr>
+      <w:r>
+        <w:rPr>
+          <w:rFonts w:ascii="Consolas" w:hAnsi="Consolas"/>
+          <w:color w:val="569CD6"/>
+          <w:sz w:val="23"/>
+          <w:szCs w:val="23"/>
+        </w:rPr>
+        <w:t>class</w:t>
+      </w:r>
+      <w:r>
+        <w:rPr>
+          <w:rFonts w:ascii="Consolas" w:hAnsi="Consolas"/>
+          <w:color w:val="D4D4D4"/>
+          <w:sz w:val="23"/>
+          <w:szCs w:val="23"/>
+        </w:rPr>
+        <w:t xml:space="preserve"> </w:t>
+      </w:r>
+      <w:r>
+        <w:rPr>
+          <w:rFonts w:ascii="Consolas" w:hAnsi="Consolas"/>
+          <w:color w:val="4EC9B0"/>
+          <w:sz w:val="23"/>
+          <w:szCs w:val="23"/>
+        </w:rPr>
+        <w:t>TaskOut</w:t>
+      </w:r>
+      <w:r>
+        <w:rPr>
+          <w:rFonts w:ascii="Consolas" w:hAnsi="Consolas"/>
+          <w:color w:val="D4D4D4"/>
+          <w:sz w:val="23"/>
+          <w:szCs w:val="23"/>
+        </w:rPr>
+        <w:t>(</w:t>
+      </w:r>
+      <w:r>
+        <w:rPr>
+          <w:rFonts w:ascii="Consolas" w:hAnsi="Consolas"/>
+          <w:color w:val="4EC9B0"/>
+          <w:sz w:val="23"/>
+          <w:szCs w:val="23"/>
+        </w:rPr>
+        <w:t>TaskBase</w:t>
+      </w:r>
+      <w:r>
+        <w:rPr>
+          <w:rFonts w:ascii="Consolas" w:hAnsi="Consolas"/>
+          <w:color w:val="D4D4D4"/>
+          <w:sz w:val="23"/>
+          <w:szCs w:val="23"/>
+        </w:rPr>
+        <w:t>):</w:t>
+      </w:r>
+    </w:p>
+    <w:p>
+      <w:pPr>
+        <w:shd w:val="clear" w:color="auto" w:fill="1E1E1E"/>
+        <w:spacing w:line="300" w:lineRule="atLeast"/>
+        <w:rPr>
+          <w:rFonts w:ascii="Consolas" w:hAnsi="Consolas"/>
+          <w:color w:val="D4D4D4"/>
+          <w:sz w:val="23"/>
+          <w:szCs w:val="23"/>
+        </w:rPr>
+      </w:pPr>
+      <w:r>
+        <w:rPr>
+          <w:rFonts w:ascii="Consolas" w:hAnsi="Consolas"/>
+          <w:color w:val="D4D4D4"/>
+          <w:sz w:val="23"/>
+          <w:szCs w:val="23"/>
+        </w:rPr>
+        <w:t xml:space="preserve">    </w:t>
+      </w:r>
+      <w:r>
+        <w:rPr>
+          <w:rFonts w:ascii="Consolas" w:hAnsi="Consolas"/>
+          <w:color w:val="9CDCFE"/>
+          <w:sz w:val="23"/>
+          <w:szCs w:val="23"/>
+        </w:rPr>
+        <w:t>id</w:t>
+      </w:r>
+      <w:r>
+        <w:rPr>
+          <w:rFonts w:ascii="Consolas" w:hAnsi="Consolas"/>
+          <w:color w:val="D4D4D4"/>
+          <w:sz w:val="23"/>
+          <w:szCs w:val="23"/>
+        </w:rPr>
+        <w:t xml:space="preserve">: </w:t>
+      </w:r>
+      <w:r>
+        <w:rPr>
+          <w:rFonts w:ascii="Consolas" w:hAnsi="Consolas"/>
+          <w:color w:val="4EC9B0"/>
+          <w:sz w:val="23"/>
+          <w:szCs w:val="23"/>
+        </w:rPr>
+        <w:t>int</w:t>
+      </w:r>
+    </w:p>
+    <w:p>
+      <w:pPr>
+        <w:shd w:val="clear" w:color="auto" w:fill="1E1E1E"/>
+        <w:spacing w:after="240" w:line="300" w:lineRule="atLeast"/>
+        <w:rPr>
+          <w:rFonts w:ascii="Consolas" w:hAnsi="Consolas"/>
+          <w:color w:val="D4D4D4"/>
+          <w:sz w:val="23"/>
+          <w:szCs w:val="23"/>
+        </w:rPr>
+      </w:pPr>
+    </w:p>
+    <w:p>
+      <w:pPr>
+        <w:shd w:val="clear" w:color="auto" w:fill="1E1E1E"/>
+        <w:spacing w:line="300" w:lineRule="atLeast"/>
+        <w:rPr>
+          <w:rFonts w:ascii="Consolas" w:hAnsi="Consolas"/>
+          <w:color w:val="D4D4D4"/>
+          <w:sz w:val="23"/>
+          <w:szCs w:val="23"/>
+        </w:rPr>
+      </w:pPr>
+      <w:r>
+        <w:rPr>
+          <w:rFonts w:ascii="Consolas" w:hAnsi="Consolas"/>
+          <w:color w:val="6A9955"/>
+          <w:sz w:val="23"/>
+          <w:szCs w:val="23"/>
+        </w:rPr>
+        <w:t># -----------------------------</w:t>
+      </w:r>
+    </w:p>
+    <w:p>
+      <w:pPr>
+        <w:shd w:val="clear" w:color="auto" w:fill="1E1E1E"/>
+        <w:spacing w:line="300" w:lineRule="atLeast"/>
+        <w:rPr>
+          <w:rFonts w:ascii="Consolas" w:hAnsi="Consolas"/>
+          <w:color w:val="D4D4D4"/>
+          <w:sz w:val="23"/>
+          <w:szCs w:val="23"/>
+        </w:rPr>
+      </w:pPr>
+      <w:r>
+        <w:rPr>
+          <w:rFonts w:ascii="Consolas" w:hAnsi="Consolas"/>
+          <w:color w:val="6A9955"/>
+          <w:sz w:val="23"/>
+          <w:szCs w:val="23"/>
+        </w:rPr>
+        <w:t># Database Table</w:t>
+      </w:r>
+    </w:p>
+    <w:p>
+      <w:pPr>
+        <w:shd w:val="clear" w:color="auto" w:fill="1E1E1E"/>
+        <w:spacing w:line="300" w:lineRule="atLeast"/>
+        <w:rPr>
+          <w:rFonts w:ascii="Consolas" w:hAnsi="Consolas"/>
+          <w:color w:val="D4D4D4"/>
+          <w:sz w:val="23"/>
+          <w:szCs w:val="23"/>
+        </w:rPr>
+      </w:pPr>
+      <w:r>
+        <w:rPr>
+          <w:rFonts w:ascii="Consolas" w:hAnsi="Consolas"/>
+          <w:color w:val="6A9955"/>
+          <w:sz w:val="23"/>
+          <w:szCs w:val="23"/>
+        </w:rPr>
+        <w:t># -----------------------------</w:t>
+      </w:r>
+    </w:p>
+    <w:p>
+      <w:pPr>
+        <w:shd w:val="clear" w:color="auto" w:fill="1E1E1E"/>
+        <w:spacing w:line="300" w:lineRule="atLeast"/>
+        <w:rPr>
+          <w:rFonts w:ascii="Consolas" w:hAnsi="Consolas"/>
+          <w:color w:val="D4D4D4"/>
+          <w:sz w:val="23"/>
+          <w:szCs w:val="23"/>
+        </w:rPr>
+      </w:pPr>
+      <w:r>
+        <w:rPr>
+          <w:rFonts w:ascii="Consolas" w:hAnsi="Consolas"/>
+          <w:color w:val="569CD6"/>
+          <w:sz w:val="23"/>
+          <w:szCs w:val="23"/>
+        </w:rPr>
+        <w:t>class</w:t>
+      </w:r>
+      <w:r>
+        <w:rPr>
+          <w:rFonts w:ascii="Consolas" w:hAnsi="Consolas"/>
+          <w:color w:val="D4D4D4"/>
+          <w:sz w:val="23"/>
+          <w:szCs w:val="23"/>
+        </w:rPr>
+        <w:t xml:space="preserve"> </w:t>
+      </w:r>
+      <w:r>
+        <w:rPr>
+          <w:rFonts w:ascii="Consolas" w:hAnsi="Consolas"/>
+          <w:color w:val="4EC9B0"/>
+          <w:sz w:val="23"/>
+          <w:szCs w:val="23"/>
+        </w:rPr>
+        <w:t>Task</w:t>
+      </w:r>
+      <w:r>
+        <w:rPr>
+          <w:rFonts w:ascii="Consolas" w:hAnsi="Consolas"/>
+          <w:color w:val="D4D4D4"/>
+          <w:sz w:val="23"/>
+          <w:szCs w:val="23"/>
+        </w:rPr>
+        <w:t>(</w:t>
+      </w:r>
+      <w:r>
+        <w:rPr>
+          <w:rFonts w:ascii="Consolas" w:hAnsi="Consolas"/>
+          <w:color w:val="4EC9B0"/>
+          <w:sz w:val="23"/>
+          <w:szCs w:val="23"/>
+        </w:rPr>
+        <w:t>TaskBase</w:t>
+      </w:r>
+      <w:r>
+        <w:rPr>
+          <w:rFonts w:ascii="Consolas" w:hAnsi="Consolas"/>
+          <w:color w:val="D4D4D4"/>
+          <w:sz w:val="23"/>
+          <w:szCs w:val="23"/>
+        </w:rPr>
+        <w:t xml:space="preserve">, </w:t>
+      </w:r>
+      <w:r>
+        <w:rPr>
+          <w:rFonts w:ascii="Consolas" w:hAnsi="Consolas"/>
+          <w:color w:val="9CDCFE"/>
+          <w:sz w:val="23"/>
+          <w:szCs w:val="23"/>
+        </w:rPr>
+        <w:t>table</w:t>
+      </w:r>
+      <w:r>
+        <w:rPr>
+          <w:rFonts w:ascii="Consolas" w:hAnsi="Consolas"/>
+          <w:color w:val="D4D4D4"/>
+          <w:sz w:val="23"/>
+          <w:szCs w:val="23"/>
+        </w:rPr>
+        <w:t>=</w:t>
+      </w:r>
+      <w:r>
+        <w:rPr>
+          <w:rFonts w:ascii="Consolas" w:hAnsi="Consolas"/>
+          <w:color w:val="4FC1FF"/>
+          <w:sz w:val="23"/>
+          <w:szCs w:val="23"/>
+        </w:rPr>
+        <w:t>True</w:t>
+      </w:r>
+      <w:r>
+        <w:rPr>
+          <w:rFonts w:ascii="Consolas" w:hAnsi="Consolas"/>
+          <w:color w:val="D4D4D4"/>
+          <w:sz w:val="23"/>
+          <w:szCs w:val="23"/>
+        </w:rPr>
+        <w:t>):</w:t>
+      </w:r>
+    </w:p>
+    <w:p>
+      <w:pPr>
+        <w:shd w:val="clear" w:color="auto" w:fill="1E1E1E"/>
+        <w:spacing w:line="300" w:lineRule="atLeast"/>
+        <w:rPr>
+          <w:rFonts w:ascii="Consolas" w:hAnsi="Consolas"/>
+          <w:color w:val="D4D4D4"/>
+          <w:sz w:val="23"/>
+          <w:szCs w:val="23"/>
+        </w:rPr>
+      </w:pPr>
+      <w:r>
+        <w:rPr>
+          <w:rFonts w:ascii="Consolas" w:hAnsi="Consolas"/>
+          <w:color w:val="D4D4D4"/>
+          <w:sz w:val="23"/>
+          <w:szCs w:val="23"/>
+        </w:rPr>
+        <w:t xml:space="preserve">    </w:t>
+      </w:r>
+      <w:r>
+        <w:rPr>
+          <w:rFonts w:ascii="Consolas" w:hAnsi="Consolas"/>
+          <w:color w:val="9CDCFE"/>
+          <w:sz w:val="23"/>
+          <w:szCs w:val="23"/>
+        </w:rPr>
+        <w:t>id</w:t>
+      </w:r>
+      <w:r>
+        <w:rPr>
+          <w:rFonts w:ascii="Consolas" w:hAnsi="Consolas"/>
+          <w:color w:val="D4D4D4"/>
+          <w:sz w:val="23"/>
+          <w:szCs w:val="23"/>
+        </w:rPr>
+        <w:t xml:space="preserve">: </w:t>
+      </w:r>
+      <w:r>
+        <w:rPr>
+          <w:rFonts w:ascii="Consolas" w:hAnsi="Consolas"/>
+          <w:color w:val="4EC9B0"/>
+          <w:sz w:val="23"/>
+          <w:szCs w:val="23"/>
+        </w:rPr>
+        <w:t>int</w:t>
+      </w:r>
+      <w:r>
+        <w:rPr>
+          <w:rFonts w:ascii="Consolas" w:hAnsi="Consolas"/>
+          <w:color w:val="D4D4D4"/>
+          <w:sz w:val="23"/>
+          <w:szCs w:val="23"/>
+        </w:rPr>
+        <w:t xml:space="preserve"> | </w:t>
+      </w:r>
+      <w:r>
+        <w:rPr>
+          <w:rFonts w:ascii="Consolas" w:hAnsi="Consolas"/>
+          <w:color w:val="4FC1FF"/>
+          <w:sz w:val="23"/>
+          <w:szCs w:val="23"/>
+        </w:rPr>
+        <w:t>None</w:t>
+      </w:r>
+      <w:r>
+        <w:rPr>
+          <w:rFonts w:ascii="Consolas" w:hAnsi="Consolas"/>
+          <w:color w:val="D4D4D4"/>
+          <w:sz w:val="23"/>
+          <w:szCs w:val="23"/>
+        </w:rPr>
+        <w:t xml:space="preserve"> = </w:t>
+      </w:r>
+      <w:r>
+        <w:rPr>
+          <w:rFonts w:ascii="Consolas" w:hAnsi="Consolas"/>
+          <w:color w:val="DCDCAA"/>
+          <w:sz w:val="23"/>
+          <w:szCs w:val="23"/>
+        </w:rPr>
+        <w:t>Field</w:t>
+      </w:r>
+      <w:r>
+        <w:rPr>
+          <w:rFonts w:ascii="Consolas" w:hAnsi="Consolas"/>
+          <w:color w:val="D4D4D4"/>
+          <w:sz w:val="23"/>
+          <w:szCs w:val="23"/>
+        </w:rPr>
+        <w:t>(</w:t>
+      </w:r>
+      <w:r>
+        <w:rPr>
+          <w:rFonts w:ascii="Consolas" w:hAnsi="Consolas"/>
+          <w:color w:val="9CDCFE"/>
+          <w:sz w:val="23"/>
+          <w:szCs w:val="23"/>
+        </w:rPr>
+        <w:t>default</w:t>
+      </w:r>
+      <w:r>
+        <w:rPr>
+          <w:rFonts w:ascii="Consolas" w:hAnsi="Consolas"/>
+          <w:color w:val="D4D4D4"/>
+          <w:sz w:val="23"/>
+          <w:szCs w:val="23"/>
+        </w:rPr>
+        <w:t>=</w:t>
+      </w:r>
+      <w:r>
+        <w:rPr>
+          <w:rFonts w:ascii="Consolas" w:hAnsi="Consolas"/>
+          <w:color w:val="4FC1FF"/>
+          <w:sz w:val="23"/>
+          <w:szCs w:val="23"/>
+        </w:rPr>
+        <w:t>None</w:t>
+      </w:r>
+      <w:r>
+        <w:rPr>
+          <w:rFonts w:ascii="Consolas" w:hAnsi="Consolas"/>
+          <w:color w:val="D4D4D4"/>
+          <w:sz w:val="23"/>
+          <w:szCs w:val="23"/>
+        </w:rPr>
+        <w:t xml:space="preserve">, </w:t>
+      </w:r>
+      <w:r>
+        <w:rPr>
+          <w:rFonts w:ascii="Consolas" w:hAnsi="Consolas"/>
+          <w:color w:val="9CDCFE"/>
+          <w:sz w:val="23"/>
+          <w:szCs w:val="23"/>
+        </w:rPr>
+        <w:t>primary_key</w:t>
+      </w:r>
+      <w:r>
+        <w:rPr>
+          <w:rFonts w:ascii="Consolas" w:hAnsi="Consolas"/>
+          <w:color w:val="D4D4D4"/>
+          <w:sz w:val="23"/>
+          <w:szCs w:val="23"/>
+        </w:rPr>
+        <w:t>=</w:t>
+      </w:r>
+      <w:r>
+        <w:rPr>
+          <w:rFonts w:ascii="Consolas" w:hAnsi="Consolas"/>
+          <w:color w:val="4FC1FF"/>
+          <w:sz w:val="23"/>
+          <w:szCs w:val="23"/>
+        </w:rPr>
+        <w:t>True</w:t>
+      </w:r>
+      <w:r>
+        <w:rPr>
+          <w:rFonts w:ascii="Consolas" w:hAnsi="Consolas"/>
+          <w:color w:val="D4D4D4"/>
+          <w:sz w:val="23"/>
+          <w:szCs w:val="23"/>
+        </w:rPr>
+        <w:t>)</w:t>
+      </w:r>
     </w:p>
     <w:bookmarkEnd w:id="0"/>
     <w:p/>
@@ -29905,7 +31444,7 @@
   <w:style w:type="paragraph" w:default="1" w:styleId="Normal">
     <w:name w:val="Normal"/>
     <w:qFormat/>
-    <w:rsid w:val="009D0E4F"/>
+    <w:rsid w:val="00C6051E"/>
     <w:pPr>
       <w:spacing w:after="0" w:line="240" w:lineRule="auto"/>
     </w:pPr>

</xml_diff>